<commit_message>
made readme and half-docs + made streaming
</commit_message>
<xml_diff>
--- a/Docs/Проектная документация Нейро-ПКГХ.docx
+++ b/Docs/Проектная документация Нейро-ПКГХ.docx
@@ -118,7 +118,16 @@
                       <w:szCs w:val="28"/>
                       <w:u w:val="single"/>
                     </w:rPr>
-                    <w:t xml:space="preserve">УЧЕБНОЙ АНАЛИТИКИ </w:t>
+                    <w:t>ИНДИВИДУАЛЬНОЙ ТРАЕКТОРИИ ОБУЧЕНИЯ</w:t>
+                  </w:r>
+                  <w:r>
+                    <w:rPr>
+                      <w:caps/>
+                      <w:sz w:val="28"/>
+                      <w:szCs w:val="28"/>
+                      <w:u w:val="single"/>
+                    </w:rPr>
+                    <w:t xml:space="preserve"> </w:t>
                   </w:r>
                   <w:r>
                     <w:rPr>
@@ -128,7 +137,7 @@
                       <w:u w:val="single"/>
                       <w:lang w:val="en-US"/>
                     </w:rPr>
-                    <w:t>LEARNAINALYTICS</w:t>
+                    <w:t>TRAJECTORYADVAICER</w:t>
                   </w:r>
                 </w:p>
                 <w:p>
@@ -1077,21 +1086,40 @@
     </w:p>
     <w:p>
       <w:r>
-        <w:t>LearnAInalytics — система автоматического анализа анкет обратной связи слушателей образовательных программ с использованием групп ИИ-агентов. Разработана для специалистов отдела дизайна образовательных пр</w:t>
-      </w:r>
-      <w:r>
-        <w:t>о</w:t>
-      </w:r>
-      <w:r>
-        <w:t>грамм и экспертиз Корпоративного университета Санкт-Петербурга.</w:t>
-      </w:r>
-    </w:p>
-    <w:p>
-      <w:pPr>
-        <w:rPr>
-          <w:lang w:val="en-US"/>
-        </w:rPr>
-      </w:pPr>
+        <w:t>TrajectoryAdvAIcer — система автоматического формирования индив</w:t>
+      </w:r>
+      <w:r>
+        <w:t>и</w:t>
+      </w:r>
+      <w:r>
+        <w:t>дуальных траекторий обучения для гос</w:t>
+      </w:r>
+      <w:r>
+        <w:t>у</w:t>
+      </w:r>
+      <w:r>
+        <w:t>дарственных гражданских служащих (ГГС) с использованием трёх групп ИИ-агентов. Разработана для специал</w:t>
+      </w:r>
+      <w:r>
+        <w:t>и</w:t>
+      </w:r>
+      <w:r>
+        <w:t>стов Корпоративного университета Санкт-Петербурга, занимающихся пл</w:t>
+      </w:r>
+      <w:r>
+        <w:t>а</w:t>
+      </w:r>
+      <w:r>
+        <w:t>нированием повышения квалиф</w:t>
+      </w:r>
+      <w:r>
+        <w:t>и</w:t>
+      </w:r>
+      <w:r>
+        <w:t>кации и электронного обучения.</w:t>
+      </w:r>
+    </w:p>
+    <w:p>
       <w:r>
         <w:t>Система обеспечивает:</w:t>
       </w:r>
@@ -1101,17 +1129,17 @@
         <w:pStyle w:val="af4"/>
         <w:numPr>
           <w:ilvl w:val="0"/>
-          <w:numId w:val="10"/>
+          <w:numId w:val="25"/>
         </w:numPr>
       </w:pPr>
       <w:r>
-        <w:t>автоматический расчёт статистик: средние баллы, медианы, ста</w:t>
-      </w:r>
-      <w:r>
-        <w:t>н</w:t>
-      </w:r>
-      <w:r>
-        <w:t>дартные отклонения, распределения оценок;</w:t>
+        <w:t>анализ истории обучения сотрудников (пройденные ППК и ЭК) на основе загружаемых фа</w:t>
+      </w:r>
+      <w:r>
+        <w:t>й</w:t>
+      </w:r>
+      <w:r>
+        <w:t>лов Excel/CSV;</w:t>
       </w:r>
     </w:p>
     <w:p>
@@ -1119,17 +1147,17 @@
         <w:pStyle w:val="af4"/>
         <w:numPr>
           <w:ilvl w:val="0"/>
-          <w:numId w:val="10"/>
+          <w:numId w:val="25"/>
         </w:numPr>
       </w:pPr>
       <w:r>
-        <w:t>интеллектуальный анализ текстовых комментариев: тематическое моделирование, сентимент-анализ, выявление ключевых пр</w:t>
-      </w:r>
-      <w:r>
-        <w:t>о</w:t>
-      </w:r>
-      <w:r>
-        <w:t>блем;</w:t>
+        <w:t>коллаборативную фильтрацию: подбор курсов, популярных ср</w:t>
+      </w:r>
+      <w:r>
+        <w:t>е</w:t>
+      </w:r>
+      <w:r>
+        <w:t>ди коллег с такой же должностью и ИОГВ, с исключением уже пройденных;</w:t>
       </w:r>
     </w:p>
     <w:p>
@@ -1137,11 +1165,17 @@
         <w:pStyle w:val="af4"/>
         <w:numPr>
           <w:ilvl w:val="0"/>
-          <w:numId w:val="10"/>
+          <w:numId w:val="25"/>
         </w:numPr>
       </w:pPr>
       <w:r>
-        <w:t>формирование структурированной аналитической справки (Word) и количественного отчёта (Excel);</w:t>
+        <w:t>генерацию персонализированных рекомендаций с обоснованиями с помощью трёх типов нейросетей: российских (GigaChat), зар</w:t>
+      </w:r>
+      <w:r>
+        <w:t>у</w:t>
+      </w:r>
+      <w:r>
+        <w:t>бежных (OpenRouter) и локальных (Ollama);</w:t>
       </w:r>
     </w:p>
     <w:p>
@@ -1149,23 +1183,11 @@
         <w:pStyle w:val="af4"/>
         <w:numPr>
           <w:ilvl w:val="0"/>
-          <w:numId w:val="10"/>
+          <w:numId w:val="25"/>
         </w:numPr>
       </w:pPr>
       <w:r>
-        <w:t>построение интерактивного дашборда с визуализациями (лине</w:t>
-      </w:r>
-      <w:r>
-        <w:t>й</w:t>
-      </w:r>
-      <w:r>
-        <w:t>чатая диаграмма, лепестковая диаграмма, тепловая карта корр</w:t>
-      </w:r>
-      <w:r>
-        <w:t>е</w:t>
-      </w:r>
-      <w:r>
-        <w:t>ляций, распределение оценок);</w:t>
+        <w:t>экспорт результатов в Excel и JSON;</w:t>
       </w:r>
     </w:p>
     <w:p>
@@ -1173,17 +1195,47 @@
         <w:pStyle w:val="af4"/>
         <w:numPr>
           <w:ilvl w:val="0"/>
-          <w:numId w:val="10"/>
+          <w:numId w:val="25"/>
         </w:numPr>
       </w:pPr>
       <w:r>
-        <w:t>поддержку российских (</w:t>
-      </w:r>
-      <w:r>
-        <w:t>GigaChat</w:t>
-      </w:r>
-      <w:r>
-        <w:t>) и зарубежных (OpenRouter) нейросетей;</w:t>
+        <w:t>интерактивный веб-интерфейс для загрузки данных и просмотра трае</w:t>
+      </w:r>
+      <w:r>
+        <w:t>к</w:t>
+      </w:r>
+      <w:r>
+        <w:t>торий в виде карточек сотрудников с переключением.</w:t>
+      </w:r>
+    </w:p>
+    <w:p>
+      <w:r>
+        <w:br w:type="page"/>
+      </w:r>
+    </w:p>
+    <w:p>
+      <w:pPr>
+        <w:pStyle w:val="a4"/>
+      </w:pPr>
+      <w:bookmarkStart w:id="1" w:name="_Toc235720837"/>
+      <w:r>
+        <w:lastRenderedPageBreak/>
+        <w:t>2. Архитектура и проектные решения</w:t>
+      </w:r>
+      <w:bookmarkEnd w:id="1"/>
+    </w:p>
+    <w:p>
+      <w:pPr>
+        <w:ind w:firstLine="0"/>
+      </w:pPr>
+      <w:r>
+        <w:t>Система построена на многослойной архитектуре с чётким разделением о</w:t>
+      </w:r>
+      <w:r>
+        <w:t>т</w:t>
+      </w:r>
+      <w:r>
+        <w:t>ветственности. Основные модули:</w:t>
       </w:r>
     </w:p>
     <w:p>
@@ -1191,41 +1243,17 @@
         <w:pStyle w:val="af4"/>
         <w:numPr>
           <w:ilvl w:val="0"/>
-          <w:numId w:val="10"/>
+          <w:numId w:val="26"/>
         </w:numPr>
       </w:pPr>
       <w:r>
-        <w:t>экспорт результатов в Word, Excel и HTML.</w:t>
-      </w:r>
-      <w:r>
-        <w:br w:type="page"/>
-      </w:r>
-    </w:p>
-    <w:p>
-      <w:pPr>
-        <w:pStyle w:val="a4"/>
-      </w:pPr>
-      <w:bookmarkStart w:id="1" w:name="_Toc235720837"/>
-      <w:r>
-        <w:lastRenderedPageBreak/>
-        <w:t>2. Архитектура и проектные решения</w:t>
-      </w:r>
-      <w:bookmarkEnd w:id="1"/>
-    </w:p>
-    <w:p>
-      <w:pPr>
-        <w:rPr>
-          <w:lang w:val="en-US"/>
-        </w:rPr>
-      </w:pPr>
-      <w:r>
-        <w:t>Система построена на многослойной архитектуре с чётким разделен</w:t>
-      </w:r>
-      <w:r>
-        <w:t>и</w:t>
-      </w:r>
-      <w:r>
-        <w:t>ем ответственности. Основные модули:</w:t>
+        <w:t>API (ASP.NET Core) – принимает два файла (история обучения и спр</w:t>
+      </w:r>
+      <w:r>
+        <w:t>а</w:t>
+      </w:r>
+      <w:r>
+        <w:t>вочник курсов), запускает конвейер анализа.</w:t>
       </w:r>
     </w:p>
     <w:p>
@@ -1233,77 +1261,17 @@
         <w:pStyle w:val="af4"/>
         <w:numPr>
           <w:ilvl w:val="0"/>
-          <w:numId w:val="11"/>
+          <w:numId w:val="26"/>
         </w:numPr>
-        <w:rPr>
-          <w:lang w:val="en-US"/>
-        </w:rPr>
-      </w:pPr>
-      <w:r>
-        <w:rPr>
-          <w:lang w:val="en-US"/>
-        </w:rPr>
-        <w:t xml:space="preserve">API (ASP.NET Core Minimal API) – </w:t>
-      </w:r>
-      <w:r>
-        <w:t>принимает</w:t>
-      </w:r>
-      <w:r>
-        <w:rPr>
-          <w:lang w:val="en-US"/>
-        </w:rPr>
-        <w:t xml:space="preserve"> </w:t>
-      </w:r>
-      <w:r>
-        <w:t>файл</w:t>
-      </w:r>
-      <w:r>
-        <w:rPr>
-          <w:lang w:val="en-US"/>
-        </w:rPr>
-        <w:t xml:space="preserve"> </w:t>
-      </w:r>
-      <w:r>
-        <w:t>анкеты</w:t>
-      </w:r>
-      <w:r>
-        <w:rPr>
-          <w:lang w:val="en-US"/>
-        </w:rPr>
-        <w:t xml:space="preserve">, </w:t>
-      </w:r>
-      <w:r>
-        <w:t>з</w:t>
-      </w:r>
-      <w:r>
-        <w:t>а</w:t>
-      </w:r>
-      <w:r>
-        <w:t>пускает</w:t>
-      </w:r>
-      <w:r>
-        <w:rPr>
-          <w:lang w:val="en-US"/>
-        </w:rPr>
-        <w:t xml:space="preserve"> </w:t>
-      </w:r>
-      <w:r>
-        <w:t>конвейер</w:t>
-      </w:r>
-      <w:r>
-        <w:rPr>
-          <w:lang w:val="en-US"/>
-        </w:rPr>
-        <w:t xml:space="preserve"> </w:t>
-      </w:r>
-      <w:r>
-        <w:t>анализа</w:t>
-      </w:r>
-      <w:r>
-        <w:rPr>
-          <w:lang w:val="en-US"/>
-        </w:rPr>
-        <w:t>.</w:t>
+      </w:pPr>
+      <w:r>
+        <w:t>Pipeline – оркестрирует этапы: парсинг → валидация → коллаборати</w:t>
+      </w:r>
+      <w:r>
+        <w:t>в</w:t>
+      </w:r>
+      <w:r>
+        <w:t>ная фильтрация → отбор кандидатов → выбор топ‑N курсов → вызов ИИ‑агента → формирование результата.</w:t>
       </w:r>
     </w:p>
     <w:p>
@@ -1311,17 +1279,17 @@
         <w:pStyle w:val="af4"/>
         <w:numPr>
           <w:ilvl w:val="0"/>
-          <w:numId w:val="11"/>
+          <w:numId w:val="26"/>
         </w:numPr>
       </w:pPr>
       <w:r>
-        <w:t>Services – оркестрирует этапы: парсинг → валидация → агрег</w:t>
-      </w:r>
-      <w:r>
-        <w:t>а</w:t>
-      </w:r>
-      <w:r>
-        <w:t>ция по критериям → вызов ИИ → сбор статистики → генерация отчёта и дашборда.</w:t>
+        <w:t>Parsing – конвертирует входные Excel / CSV в унифицированные мод</w:t>
+      </w:r>
+      <w:r>
+        <w:t>е</w:t>
+      </w:r>
+      <w:r>
+        <w:t>ли (LearningHistory, CourseCatalog).</w:t>
       </w:r>
     </w:p>
     <w:p>
@@ -1329,17 +1297,17 @@
         <w:pStyle w:val="af4"/>
         <w:numPr>
           <w:ilvl w:val="0"/>
-          <w:numId w:val="11"/>
+          <w:numId w:val="26"/>
         </w:numPr>
       </w:pPr>
       <w:r>
-        <w:t>Parsing – конвертирует входные Excel / CSV / ZIP в унифицир</w:t>
-      </w:r>
-      <w:r>
-        <w:t>о</w:t>
-      </w:r>
-      <w:r>
-        <w:t>ванные модели (SurveyParseResult).</w:t>
+        <w:t>Validation – проверяет целостность данных, удаляет дубликаты, выя</w:t>
+      </w:r>
+      <w:r>
+        <w:t>в</w:t>
+      </w:r>
+      <w:r>
+        <w:t>ляет курсы, отсутствующие в справочнике.</w:t>
       </w:r>
     </w:p>
     <w:p>
@@ -1347,17 +1315,38 @@
         <w:pStyle w:val="af4"/>
         <w:numPr>
           <w:ilvl w:val="0"/>
-          <w:numId w:val="11"/>
+          <w:numId w:val="26"/>
         </w:numPr>
-      </w:pPr>
-      <w:r>
-        <w:t>Validation – отсеивает неинформативные ответы (прочерки, «з</w:t>
-      </w:r>
-      <w:r>
-        <w:t>а</w:t>
-      </w:r>
-      <w:r>
-        <w:t>трудняюсь ответить», общие фразы), проверяет корректность оценок.</w:t>
+        <w:rPr>
+          <w:lang w:val="en-US"/>
+        </w:rPr>
+      </w:pPr>
+      <w:r>
+        <w:rPr>
+          <w:lang w:val="en-US"/>
+        </w:rPr>
+        <w:t xml:space="preserve">Analysis – </w:t>
+      </w:r>
+      <w:r>
+        <w:t>сервисы</w:t>
+      </w:r>
+      <w:r>
+        <w:rPr>
+          <w:lang w:val="en-US"/>
+        </w:rPr>
+        <w:t xml:space="preserve"> CollaborativeFilteringService, CourseCandidateSele</w:t>
+      </w:r>
+      <w:r>
+        <w:rPr>
+          <w:lang w:val="en-US"/>
+        </w:rPr>
+        <w:t>c</w:t>
+      </w:r>
+      <w:r>
+        <w:rPr>
+          <w:lang w:val="en-US"/>
+        </w:rPr>
+        <w:t>tor, TopCourseSelector.</w:t>
       </w:r>
     </w:p>
     <w:p>
@@ -1365,17 +1354,35 @@
         <w:pStyle w:val="af4"/>
         <w:numPr>
           <w:ilvl w:val="0"/>
-          <w:numId w:val="11"/>
+          <w:numId w:val="26"/>
         </w:numPr>
-      </w:pPr>
-      <w:r>
-        <w:t>Analysis – группирует ответы по пяти критериям (Полезность, Практика, Доступность, Взаимодействие, Вовлечённость), в</w:t>
-      </w:r>
-      <w:r>
-        <w:t>ы</w:t>
-      </w:r>
-      <w:r>
-        <w:t>числяет статистики, вызывает ИИ-агентов для текстового анализа и генерации выводов.</w:t>
+        <w:rPr>
+          <w:lang w:val="en-US"/>
+        </w:rPr>
+      </w:pPr>
+      <w:r>
+        <w:rPr>
+          <w:lang w:val="en-US"/>
+        </w:rPr>
+        <w:t xml:space="preserve">Agent.Contracts – </w:t>
+      </w:r>
+      <w:r>
+        <w:t>интерфейсы</w:t>
+      </w:r>
+      <w:r>
+        <w:rPr>
+          <w:lang w:val="en-US"/>
+        </w:rPr>
+        <w:t xml:space="preserve"> ILlmClient, IPromptProvider; </w:t>
+      </w:r>
+      <w:r>
+        <w:t>фабрика</w:t>
+      </w:r>
+      <w:r>
+        <w:rPr>
+          <w:lang w:val="en-US"/>
+        </w:rPr>
+        <w:t xml:space="preserve"> ILlmFactory.</w:t>
       </w:r>
     </w:p>
     <w:p>
@@ -1383,17 +1390,17 @@
         <w:pStyle w:val="af4"/>
         <w:numPr>
           <w:ilvl w:val="0"/>
-          <w:numId w:val="11"/>
+          <w:numId w:val="26"/>
         </w:numPr>
       </w:pPr>
       <w:r>
-        <w:t>Agent.Contracts – интерфейсы для LLM-клиентов, фабрика аге</w:t>
-      </w:r>
-      <w:r>
-        <w:t>н</w:t>
-      </w:r>
-      <w:r>
-        <w:t>тов.</w:t>
+        <w:t>Агенты – реализации для GigaChat (российский), OpenRouter (зарубе</w:t>
+      </w:r>
+      <w:r>
+        <w:t>ж</w:t>
+      </w:r>
+      <w:r>
+        <w:t>ный) и Ollama (локальный).</w:t>
       </w:r>
     </w:p>
     <w:p>
@@ -1401,17 +1408,11 @@
         <w:pStyle w:val="af4"/>
         <w:numPr>
           <w:ilvl w:val="0"/>
-          <w:numId w:val="11"/>
+          <w:numId w:val="26"/>
         </w:numPr>
       </w:pPr>
       <w:r>
-        <w:t xml:space="preserve">Агенты – реализации для </w:t>
-      </w:r>
-      <w:r>
-        <w:t>GigaChat</w:t>
-      </w:r>
-      <w:r>
-        <w:t xml:space="preserve"> и OpenRouter (OpenAI-совместимый интерфейс).</w:t>
+        <w:t>Reporting – экспортёр в Excel с форматированием.</w:t>
       </w:r>
     </w:p>
     <w:p>
@@ -1419,54 +1420,21 @@
         <w:pStyle w:val="af4"/>
         <w:numPr>
           <w:ilvl w:val="0"/>
-          <w:numId w:val="11"/>
+          <w:numId w:val="26"/>
         </w:numPr>
       </w:pPr>
       <w:r>
-        <w:t>Reporting – экспорт в Excel и Word с цветовым форматированием, генерация HTML-дашборда.</w:t>
-      </w:r>
-    </w:p>
-    <w:p>
-      <w:pPr>
-        <w:pStyle w:val="af4"/>
-        <w:numPr>
-          <w:ilvl w:val="0"/>
-          <w:numId w:val="11"/>
-        </w:numPr>
-      </w:pPr>
-      <w:r>
-        <w:t>Web UI (Blazor Server) – одна интерактивная страница для з</w:t>
-      </w:r>
-      <w:r>
-        <w:t>а</w:t>
-      </w:r>
-      <w:r>
-        <w:t>грузки анкеты и отображения результатов с визуализациями.</w:t>
-      </w:r>
-    </w:p>
-    <w:p>
-      <w:r>
-        <w:t>Взаимодействие компонентов отражено на общей архитектурной схеме</w:t>
-      </w:r>
-      <w:r>
-        <w:t xml:space="preserve"> (</w:t>
-      </w:r>
-      <w:r>
-        <w:t>рис. 2.1</w:t>
-      </w:r>
-      <w:r>
-        <w:t>)</w:t>
-      </w:r>
-      <w:r>
-        <w:t>.</w:t>
+        <w:t>Web UI (Blazor Server) – интерактивная страница для загрузки данных, выбора типа нейросети и отображения результатов в виде слайдера с карточками сотрудников.</w:t>
+      </w:r>
+    </w:p>
+    <w:p>
+      <w:r>
+        <w:t>Взаимодействие компонентов отражено на общей архитектурной схеме (рис. 2.1).</w:t>
       </w:r>
     </w:p>
     <w:p>
       <w:pPr>
         <w:ind w:firstLine="0"/>
-        <w:rPr>
-          <w:lang w:val="en-US"/>
-        </w:rPr>
       </w:pPr>
       <w:r>
         <w:rPr>
@@ -1475,9 +1443,9 @@
         <w:lastRenderedPageBreak/>
         <w:drawing>
           <wp:inline distT="0" distB="0" distL="0" distR="0">
-            <wp:extent cx="5940425" cy="2025922"/>
+            <wp:extent cx="5940425" cy="2298848"/>
             <wp:effectExtent l="19050" t="0" r="3175" b="0"/>
-            <wp:docPr id="7" name="Рисунок 7"/>
+            <wp:docPr id="3" name="Рисунок 1"/>
             <wp:cNvGraphicFramePr>
               <a:graphicFrameLocks xmlns:a="http://schemas.openxmlformats.org/drawingml/2006/main" noChangeAspect="1"/>
             </wp:cNvGraphicFramePr>
@@ -1485,7 +1453,7 @@
               <a:graphicData uri="http://schemas.openxmlformats.org/drawingml/2006/picture">
                 <pic:pic xmlns:pic="http://schemas.openxmlformats.org/drawingml/2006/picture">
                   <pic:nvPicPr>
-                    <pic:cNvPr id="0" name="Picture 7"/>
+                    <pic:cNvPr id="0" name="Picture 1"/>
                     <pic:cNvPicPr>
                       <a:picLocks noChangeAspect="1" noChangeArrowheads="1"/>
                     </pic:cNvPicPr>
@@ -1500,7 +1468,7 @@
                   <pic:spPr bwMode="auto">
                     <a:xfrm>
                       <a:off x="0" y="0"/>
-                      <a:ext cx="5940425" cy="2025922"/>
+                      <a:ext cx="5940425" cy="2298848"/>
                     </a:xfrm>
                     <a:prstGeom prst="rect">
                       <a:avLst/>
@@ -1638,7 +1606,19 @@
         <w:rPr>
           <w:lang w:val="en-US"/>
         </w:rPr>
-        <w:t xml:space="preserve"> API, OpenRouter API.</w:t>
+        <w:t xml:space="preserve"> API, OpenRouter API</w:t>
+      </w:r>
+      <w:r>
+        <w:rPr>
+          <w:lang w:val="en-US"/>
+        </w:rPr>
+        <w:t>, Ollama API</w:t>
+      </w:r>
+      <w:r>
+        <w:rPr>
+          <w:lang w:val="en-US"/>
+        </w:rPr>
+        <w:t>.</w:t>
       </w:r>
     </w:p>
     <w:p>
@@ -1699,18 +1679,61 @@
         <w:rPr>
           <w:b/>
         </w:rPr>
-        <w:t>3.1. Подготовка данных для анализа</w:t>
-      </w:r>
-    </w:p>
-    <w:p>
-      <w:r>
-        <w:t>Анкета загружается в формате Excel/CSV. Парсер извлекает список в</w:t>
+        <w:t xml:space="preserve">3.1. </w:t>
+      </w:r>
+      <w:r>
+        <w:rPr>
+          <w:b/>
+        </w:rPr>
+        <w:t>Подготовка данных и коллаборативная фильтрация</w:t>
+      </w:r>
+    </w:p>
+    <w:p>
+      <w:r>
+        <w:t>История обучения и справочник курсов загружаются в формате Excel/CSV. Парсер извлекает профили сотрудников, записи о прохождении и описания курсов. Валидатор очищает данные от дубликатов и неполных з</w:t>
+      </w:r>
+      <w:r>
+        <w:t>а</w:t>
+      </w:r>
+      <w:r>
+        <w:t>писей. Далее для каждого сотрудника система находит коллег с такой же должностью и ИОГВ, подсчитывает популярность курсов (сколько раз про</w:t>
+      </w:r>
+      <w:r>
+        <w:t>й</w:t>
+      </w:r>
+      <w:r>
+        <w:t>дены) и отбирает кандидатов, исключая уже пройденные сотрудником.</w:t>
+      </w:r>
+    </w:p>
+    <w:p>
+      <w:pPr>
+        <w:jc w:val="center"/>
+        <w:rPr>
+          <w:b/>
+        </w:rPr>
+      </w:pPr>
+      <w:r>
+        <w:rPr>
+          <w:b/>
+        </w:rPr>
+        <w:t xml:space="preserve">3.2. </w:t>
+      </w:r>
+      <w:r>
+        <w:rPr>
+          <w:b/>
+        </w:rPr>
+        <w:t>Отбор топ‑N рекомендаций</w:t>
+      </w:r>
+    </w:p>
+    <w:p>
+      <w:r>
+        <w:t>Из кандидатов выбираются курсы, прошедшие порог популярности (например, не менее 20% п</w:t>
       </w:r>
       <w:r>
         <w:t>о</w:t>
       </w:r>
       <w:r>
-        <w:t>просов и ответов. Валидатор очищает данные от прочерков, «затрудняюсь ответить», общих фраз («всё», «ничего») с учётом контекста вопроса.</w:t>
+        <w:t>хожих коллег), и ограничиваются числом N (по умолчанию 5). Эти курсы становятся основой для запроса к ИИ-агенту.</w:t>
       </w:r>
     </w:p>
     <w:p>
@@ -1724,138 +1747,234 @@
         <w:rPr>
           <w:b/>
         </w:rPr>
-        <w:t>3.2. Агрегация по критериям</w:t>
-      </w:r>
-    </w:p>
-    <w:p>
-      <w:pPr>
-        <w:rPr>
-          <w:lang w:val="en-US"/>
-        </w:rPr>
-      </w:pPr>
-      <w:r>
-        <w:t>Сервис SurveyAggregator распределяет вопросы по пяти критериям на основе ключевых слов. Для каждого критерия формируется:</w:t>
-      </w:r>
-    </w:p>
-    <w:p>
-      <w:pPr>
-        <w:pStyle w:val="af4"/>
-        <w:numPr>
-          <w:ilvl w:val="0"/>
-          <w:numId w:val="14"/>
-        </w:numPr>
-      </w:pPr>
-      <w:r>
-        <w:t>статистика (средний балл, распределение оценок 1–10);</w:t>
-      </w:r>
-    </w:p>
-    <w:p>
-      <w:pPr>
-        <w:pStyle w:val="af4"/>
-        <w:numPr>
-          <w:ilvl w:val="0"/>
-          <w:numId w:val="14"/>
-        </w:numPr>
-      </w:pPr>
-      <w:r>
-        <w:t>текстовые ответы (только информативные, сгруппированные по вопросам).</w:t>
-      </w:r>
-    </w:p>
-    <w:p>
-      <w:pPr>
-        <w:jc w:val="center"/>
+        <w:t xml:space="preserve">3.3. </w:t>
+      </w:r>
+      <w:r>
         <w:rPr>
           <w:b/>
         </w:rPr>
-      </w:pPr>
-      <w:r>
-        <w:rPr>
-          <w:b/>
-        </w:rPr>
-        <w:t>3.3. Генерация примечаний (агент анализа критериев)</w:t>
-      </w:r>
-    </w:p>
-    <w:p>
-      <w:r>
-        <w:t>Для каждого критерия создаётся промпт, содержащий статистику и текстовые ответы. Агент возвращает связный текст на 3–8 предложений д</w:t>
-      </w:r>
-      <w:r>
+        <w:t>Генерация траектории (агент рекомендаций)</w:t>
+      </w:r>
+    </w:p>
+    <w:p>
+      <w:r>
+        <w:t>Для каждого сотрудника формируется промпт, содержащий его пр</w:t>
+      </w:r>
+      <w:r>
+        <w:t>о</w:t>
+      </w:r>
+      <w:r>
+        <w:t>филь, пройденные курсы и рекомендованные курсы с описаниями и стат</w:t>
+      </w:r>
+      <w:r>
+        <w:t>и</w:t>
+      </w:r>
+      <w:r>
+        <w:t>стикой популярности</w:t>
+      </w:r>
+      <w:r>
+        <w:t xml:space="preserve"> (рис 3.3.1)</w:t>
+      </w:r>
+      <w:r>
+        <w:t>.</w:t>
+      </w:r>
+    </w:p>
+    <w:p>
+      <w:r>
+        <w:t xml:space="preserve">Пример промпта </w:t>
+      </w:r>
+      <w:r>
+        <w:t>(фрагмент):</w:t>
+      </w:r>
+    </w:p>
+    <w:p>
+      <w:pPr>
+        <w:rPr>
+          <w:i/>
+          <w:sz w:val="24"/>
+        </w:rPr>
+      </w:pPr>
+      <w:r>
+        <w:rPr>
+          <w:i/>
+          <w:sz w:val="24"/>
+        </w:rPr>
+        <w:t>«Ты — консультант по обучению государственных гражданских служащих. С</w:t>
+      </w:r>
+      <w:r>
+        <w:rPr>
+          <w:i/>
+          <w:sz w:val="24"/>
+        </w:rPr>
+        <w:t>о</w:t>
+      </w:r>
+      <w:r>
+        <w:rPr>
+          <w:i/>
+          <w:sz w:val="24"/>
+        </w:rPr>
+        <w:t>ставь индивидуальную траекторию обучения для сотрудника:</w:t>
+      </w:r>
+    </w:p>
+    <w:p>
+      <w:pPr>
+        <w:rPr>
+          <w:i/>
+          <w:sz w:val="24"/>
+        </w:rPr>
+      </w:pPr>
+      <w:r>
+        <w:rPr>
+          <w:i/>
+          <w:sz w:val="24"/>
+        </w:rPr>
+        <w:t>Должность: Начальник Управления - главный бухгалтер Администрации Губерн</w:t>
+      </w:r>
+      <w:r>
+        <w:rPr>
+          <w:i/>
+          <w:sz w:val="24"/>
+        </w:rPr>
+        <w:t>а</w:t>
+      </w:r>
+      <w:r>
+        <w:rPr>
+          <w:i/>
+          <w:sz w:val="24"/>
+        </w:rPr>
+        <w:t>тора Санкт-Петербурга</w:t>
+      </w:r>
+    </w:p>
+    <w:p>
+      <w:pPr>
+        <w:rPr>
+          <w:i/>
+          <w:sz w:val="24"/>
+        </w:rPr>
+      </w:pPr>
+      <w:r>
+        <w:rPr>
+          <w:i/>
+          <w:sz w:val="24"/>
+        </w:rPr>
+        <w:t>ИОГВ: Администрация Губернатора</w:t>
+      </w:r>
+    </w:p>
+    <w:p>
+      <w:pPr>
+        <w:rPr>
+          <w:i/>
+          <w:sz w:val="24"/>
+        </w:rPr>
+      </w:pPr>
+      <w:r>
+        <w:rPr>
+          <w:i/>
+          <w:sz w:val="24"/>
+        </w:rPr>
+        <w:t>Пройденные курсы: Основы Конституции РФ, Критическое мышл</w:t>
+      </w:r>
+      <w:r>
+        <w:rPr>
+          <w:i/>
+          <w:sz w:val="24"/>
+        </w:rPr>
         <w:t>е</w:t>
       </w:r>
       <w:r>
-        <w:t>ловым стилем.</w:t>
-      </w:r>
-    </w:p>
-    <w:p>
-      <w:r>
-        <w:t>Пример промпта (фрагмент):</w:t>
-      </w:r>
-    </w:p>
-    <w:p>
-      <w:pPr>
         <w:rPr>
           <w:i/>
-        </w:rPr>
-      </w:pPr>
-      <w:r>
+          <w:sz w:val="24"/>
+        </w:rPr>
+        <w:t>ние...</w:t>
+      </w:r>
+    </w:p>
+    <w:p>
+      <w:pPr>
         <w:rPr>
           <w:i/>
-        </w:rPr>
-        <w:t>«Ты — аналитик образовательных программ. Проанализируй ответы слушателей по критерию «Полезность программы». Статистика: средний балл — 9.3 из 10. Распределение: 1-3: 0%, 4-7: 4.8%, 8-10: 95.2%. Ответы на вопросы: Вопрос: «Какие вопросы были наиболее актуальны?» - «создание промтов, презентаций, видео, картинок» … На основе этих данных напиши Примечание на 3-8 предложений деловым стилем. Указывай точные ци</w:t>
-      </w:r>
+          <w:sz w:val="24"/>
+        </w:rPr>
+      </w:pPr>
       <w:r>
         <w:rPr>
           <w:i/>
-        </w:rPr>
-        <w:t>ф</w:t>
+          <w:sz w:val="24"/>
+        </w:rPr>
+        <w:t>На основе опыта коллег</w:t>
       </w:r>
       <w:r>
         <w:rPr>
           <w:i/>
-        </w:rPr>
-        <w:t>ры.»</w:t>
-      </w:r>
-    </w:p>
-    <w:p>
-      <w:r>
-        <w:t>Ответ нейросети добавляется в аналитическую справку как примечание к критерию.</w:t>
-      </w:r>
-    </w:p>
-    <w:p>
-      <w:pPr>
-        <w:jc w:val="center"/>
-        <w:rPr>
-          <w:b/>
-        </w:rPr>
-      </w:pPr>
-      <w:r>
-        <w:rPr>
-          <w:b/>
-        </w:rPr>
-        <w:t>3.4. Формирование траектории изменений (финальный агент)</w:t>
-      </w:r>
-    </w:p>
-    <w:p>
-      <w:r>
-        <w:t>После получения всех примечаний и агрегированных данных (предл</w:t>
-      </w:r>
-      <w:r>
-        <w:t>о</w:t>
-      </w:r>
-      <w:r>
-        <w:t>жения исключить/добавить темы, распределение форматов обучения) выз</w:t>
-      </w:r>
-      <w:r>
-        <w:t>ы</w:t>
-      </w:r>
-      <w:r>
-        <w:t>вается второй агент. Он генерирует раздел «Траектория изменения програ</w:t>
-      </w:r>
-      <w:r>
-        <w:t>м</w:t>
-      </w:r>
-      <w:r>
-        <w:t>мы» с конкретными выводами и рекомендациями.</w:t>
+          <w:sz w:val="24"/>
+        </w:rPr>
+        <w:t xml:space="preserve"> рекомендуются следующие курсы:</w:t>
+      </w:r>
+    </w:p>
+    <w:p>
+      <w:pPr>
+        <w:rPr>
+          <w:i/>
+          <w:sz w:val="24"/>
+        </w:rPr>
+      </w:pPr>
+      <w:r>
+        <w:rPr>
+          <w:i/>
+          <w:sz w:val="24"/>
+        </w:rPr>
+        <w:t>«Русский язык на государственной гражданской службе» (популярность: 3 из 3 коллег)</w:t>
+      </w:r>
+    </w:p>
+    <w:p>
+      <w:pPr>
+        <w:rPr>
+          <w:i/>
+          <w:sz w:val="24"/>
+        </w:rPr>
+      </w:pPr>
+      <w:r>
+        <w:rPr>
+          <w:i/>
+          <w:sz w:val="24"/>
+        </w:rPr>
+        <w:t>Описание: ...</w:t>
+      </w:r>
+    </w:p>
+    <w:p>
+      <w:pPr>
+        <w:rPr>
+          <w:i/>
+          <w:sz w:val="24"/>
+        </w:rPr>
+      </w:pPr>
+      <w:r>
+        <w:rPr>
+          <w:i/>
+          <w:sz w:val="24"/>
+        </w:rPr>
+        <w:t>...</w:t>
+      </w:r>
+    </w:p>
+    <w:p>
+      <w:r>
+        <w:rPr>
+          <w:i/>
+          <w:sz w:val="24"/>
+        </w:rPr>
+        <w:t>Сформируй персональную траекторию: перечисли курсы в логическом порядке, для каждого дай краткое обоснование (1-2 предложения), почему этот курс важен именно для этой должности. Верни JSON: { "trajectory": [ { "courseTitle": "...", "rationale": "..." } ] }.»</w:t>
+      </w:r>
+    </w:p>
+    <w:p>
+      <w:r>
+        <w:lastRenderedPageBreak/>
+        <w:t>Агент возвращает JSON, который парсится в список рекомендаций и отображается в интерфейсе</w:t>
+      </w:r>
+      <w:r>
+        <w:t xml:space="preserve"> (рис 3.3.2)</w:t>
+      </w:r>
+      <w:r>
+        <w:t>.</w:t>
       </w:r>
     </w:p>
     <w:p>
@@ -1870,12 +1989,11 @@
         <w:rPr>
           <w:noProof/>
         </w:rPr>
-        <w:lastRenderedPageBreak/>
         <w:drawing>
           <wp:inline distT="0" distB="0" distL="0" distR="0">
-            <wp:extent cx="5940425" cy="4329802"/>
+            <wp:extent cx="5940425" cy="5323719"/>
             <wp:effectExtent l="19050" t="0" r="3175" b="0"/>
-            <wp:docPr id="1" name="Рисунок 1"/>
+            <wp:docPr id="58" name="Рисунок 58"/>
             <wp:cNvGraphicFramePr>
               <a:graphicFrameLocks xmlns:a="http://schemas.openxmlformats.org/drawingml/2006/main" noChangeAspect="1"/>
             </wp:cNvGraphicFramePr>
@@ -1883,7 +2001,7 @@
               <a:graphicData uri="http://schemas.openxmlformats.org/drawingml/2006/picture">
                 <pic:pic xmlns:pic="http://schemas.openxmlformats.org/drawingml/2006/picture">
                   <pic:nvPicPr>
-                    <pic:cNvPr id="0" name="Picture 1"/>
+                    <pic:cNvPr id="0" name="Picture 58"/>
                     <pic:cNvPicPr>
                       <a:picLocks noChangeAspect="1" noChangeArrowheads="1"/>
                     </pic:cNvPicPr>
@@ -1898,7 +2016,7 @@
                   <pic:spPr bwMode="auto">
                     <a:xfrm>
                       <a:off x="0" y="0"/>
-                      <a:ext cx="5940425" cy="4329802"/>
+                      <a:ext cx="5940425" cy="5323719"/>
                     </a:xfrm>
                     <a:prstGeom prst="rect">
                       <a:avLst/>
@@ -1963,6 +2081,7 @@
         <w:rPr>
           <w:noProof/>
         </w:rPr>
+        <w:lastRenderedPageBreak/>
         <w:drawing>
           <wp:inline distT="0" distB="0" distL="0" distR="0">
             <wp:extent cx="5467350" cy="3385408"/>
@@ -2051,13 +2170,7 @@
         <w:rPr>
           <w:sz w:val="24"/>
         </w:rPr>
-        <w:t xml:space="preserve">Сформированные </w:t>
-      </w:r>
-      <w:r>
-        <w:rPr>
-          <w:sz w:val="24"/>
-        </w:rPr>
-        <w:t>примечания</w:t>
+        <w:t>Сгенерированная траектория</w:t>
       </w:r>
       <w:r>
         <w:rPr>
@@ -5786,7 +5899,7 @@
             <w:noProof/>
             <w:color w:val="auto"/>
           </w:rPr>
-          <w:t>19</w:t>
+          <w:t>8</w:t>
         </w:r>
         <w:r>
           <w:rPr>
@@ -6255,6 +6368,119 @@
     </w:lvl>
   </w:abstractNum>
   <w:abstractNum w:abstractNumId="4">
+    <w:nsid w:val="270B0CE6"/>
+    <w:multiLevelType w:val="hybridMultilevel"/>
+    <w:tmpl w:val="03F65A12"/>
+    <w:lvl w:ilvl="0" w:tplc="4D5898E8">
+      <w:start w:val="1"/>
+      <w:numFmt w:val="bullet"/>
+      <w:lvlText w:val=""/>
+      <w:lvlJc w:val="left"/>
+      <w:pPr>
+        <w:ind w:left="1429" w:hanging="360"/>
+      </w:pPr>
+      <w:rPr>
+        <w:rFonts w:ascii="Symbol" w:hAnsi="Symbol" w:hint="default"/>
+      </w:rPr>
+    </w:lvl>
+    <w:lvl w:ilvl="1" w:tplc="04190003" w:tentative="1">
+      <w:start w:val="1"/>
+      <w:numFmt w:val="bullet"/>
+      <w:lvlText w:val="o"/>
+      <w:lvlJc w:val="left"/>
+      <w:pPr>
+        <w:ind w:left="2149" w:hanging="360"/>
+      </w:pPr>
+      <w:rPr>
+        <w:rFonts w:ascii="Courier New" w:hAnsi="Courier New" w:cs="Courier New" w:hint="default"/>
+      </w:rPr>
+    </w:lvl>
+    <w:lvl w:ilvl="2" w:tplc="04190005" w:tentative="1">
+      <w:start w:val="1"/>
+      <w:numFmt w:val="bullet"/>
+      <w:lvlText w:val=""/>
+      <w:lvlJc w:val="left"/>
+      <w:pPr>
+        <w:ind w:left="2869" w:hanging="360"/>
+      </w:pPr>
+      <w:rPr>
+        <w:rFonts w:ascii="Wingdings" w:hAnsi="Wingdings" w:hint="default"/>
+      </w:rPr>
+    </w:lvl>
+    <w:lvl w:ilvl="3" w:tplc="04190001" w:tentative="1">
+      <w:start w:val="1"/>
+      <w:numFmt w:val="bullet"/>
+      <w:lvlText w:val=""/>
+      <w:lvlJc w:val="left"/>
+      <w:pPr>
+        <w:ind w:left="3589" w:hanging="360"/>
+      </w:pPr>
+      <w:rPr>
+        <w:rFonts w:ascii="Symbol" w:hAnsi="Symbol" w:hint="default"/>
+      </w:rPr>
+    </w:lvl>
+    <w:lvl w:ilvl="4" w:tplc="04190003" w:tentative="1">
+      <w:start w:val="1"/>
+      <w:numFmt w:val="bullet"/>
+      <w:lvlText w:val="o"/>
+      <w:lvlJc w:val="left"/>
+      <w:pPr>
+        <w:ind w:left="4309" w:hanging="360"/>
+      </w:pPr>
+      <w:rPr>
+        <w:rFonts w:ascii="Courier New" w:hAnsi="Courier New" w:cs="Courier New" w:hint="default"/>
+      </w:rPr>
+    </w:lvl>
+    <w:lvl w:ilvl="5" w:tplc="04190005" w:tentative="1">
+      <w:start w:val="1"/>
+      <w:numFmt w:val="bullet"/>
+      <w:lvlText w:val=""/>
+      <w:lvlJc w:val="left"/>
+      <w:pPr>
+        <w:ind w:left="5029" w:hanging="360"/>
+      </w:pPr>
+      <w:rPr>
+        <w:rFonts w:ascii="Wingdings" w:hAnsi="Wingdings" w:hint="default"/>
+      </w:rPr>
+    </w:lvl>
+    <w:lvl w:ilvl="6" w:tplc="04190001" w:tentative="1">
+      <w:start w:val="1"/>
+      <w:numFmt w:val="bullet"/>
+      <w:lvlText w:val=""/>
+      <w:lvlJc w:val="left"/>
+      <w:pPr>
+        <w:ind w:left="5749" w:hanging="360"/>
+      </w:pPr>
+      <w:rPr>
+        <w:rFonts w:ascii="Symbol" w:hAnsi="Symbol" w:hint="default"/>
+      </w:rPr>
+    </w:lvl>
+    <w:lvl w:ilvl="7" w:tplc="04190003" w:tentative="1">
+      <w:start w:val="1"/>
+      <w:numFmt w:val="bullet"/>
+      <w:lvlText w:val="o"/>
+      <w:lvlJc w:val="left"/>
+      <w:pPr>
+        <w:ind w:left="6469" w:hanging="360"/>
+      </w:pPr>
+      <w:rPr>
+        <w:rFonts w:ascii="Courier New" w:hAnsi="Courier New" w:cs="Courier New" w:hint="default"/>
+      </w:rPr>
+    </w:lvl>
+    <w:lvl w:ilvl="8" w:tplc="04190005" w:tentative="1">
+      <w:start w:val="1"/>
+      <w:numFmt w:val="bullet"/>
+      <w:lvlText w:val=""/>
+      <w:lvlJc w:val="left"/>
+      <w:pPr>
+        <w:ind w:left="7189" w:hanging="360"/>
+      </w:pPr>
+      <w:rPr>
+        <w:rFonts w:ascii="Wingdings" w:hAnsi="Wingdings" w:hint="default"/>
+      </w:rPr>
+    </w:lvl>
+  </w:abstractNum>
+  <w:abstractNum w:abstractNumId="5">
     <w:nsid w:val="2C5A2941"/>
     <w:multiLevelType w:val="hybridMultilevel"/>
     <w:tmpl w:val="CBF65652"/>
@@ -6367,7 +6593,7 @@
       </w:rPr>
     </w:lvl>
   </w:abstractNum>
-  <w:abstractNum w:abstractNumId="5">
+  <w:abstractNum w:abstractNumId="6">
     <w:nsid w:val="34D915D6"/>
     <w:multiLevelType w:val="hybridMultilevel"/>
     <w:tmpl w:val="C8085902"/>
@@ -6480,7 +6706,7 @@
       </w:rPr>
     </w:lvl>
   </w:abstractNum>
-  <w:abstractNum w:abstractNumId="6">
+  <w:abstractNum w:abstractNumId="7">
     <w:nsid w:val="404C5B81"/>
     <w:multiLevelType w:val="hybridMultilevel"/>
     <w:tmpl w:val="643E0C94"/>
@@ -6593,7 +6819,7 @@
       </w:rPr>
     </w:lvl>
   </w:abstractNum>
-  <w:abstractNum w:abstractNumId="7">
+  <w:abstractNum w:abstractNumId="8">
     <w:nsid w:val="41786C57"/>
     <w:multiLevelType w:val="hybridMultilevel"/>
     <w:tmpl w:val="4CCA6E1C"/>
@@ -6706,7 +6932,7 @@
       </w:rPr>
     </w:lvl>
   </w:abstractNum>
-  <w:abstractNum w:abstractNumId="8">
+  <w:abstractNum w:abstractNumId="9">
     <w:nsid w:val="45FE765B"/>
     <w:multiLevelType w:val="hybridMultilevel"/>
     <w:tmpl w:val="924E4C7C"/>
@@ -6819,7 +7045,7 @@
       </w:rPr>
     </w:lvl>
   </w:abstractNum>
-  <w:abstractNum w:abstractNumId="9">
+  <w:abstractNum w:abstractNumId="10">
     <w:nsid w:val="47C4799A"/>
     <w:multiLevelType w:val="hybridMultilevel"/>
     <w:tmpl w:val="D0CCD2BA"/>
@@ -6932,7 +7158,7 @@
       </w:rPr>
     </w:lvl>
   </w:abstractNum>
-  <w:abstractNum w:abstractNumId="10">
+  <w:abstractNum w:abstractNumId="11">
     <w:nsid w:val="49FE5023"/>
     <w:multiLevelType w:val="hybridMultilevel"/>
     <w:tmpl w:val="1298C5B6"/>
@@ -7045,7 +7271,7 @@
       </w:rPr>
     </w:lvl>
   </w:abstractNum>
-  <w:abstractNum w:abstractNumId="11">
+  <w:abstractNum w:abstractNumId="12">
     <w:nsid w:val="4F292354"/>
     <w:multiLevelType w:val="hybridMultilevel"/>
     <w:tmpl w:val="1EAADE06"/>
@@ -7158,7 +7384,7 @@
       </w:rPr>
     </w:lvl>
   </w:abstractNum>
-  <w:abstractNum w:abstractNumId="12">
+  <w:abstractNum w:abstractNumId="13">
     <w:nsid w:val="4F2D2DA1"/>
     <w:multiLevelType w:val="hybridMultilevel"/>
     <w:tmpl w:val="563E0F88"/>
@@ -7244,7 +7470,7 @@
       </w:pPr>
     </w:lvl>
   </w:abstractNum>
-  <w:abstractNum w:abstractNumId="13">
+  <w:abstractNum w:abstractNumId="14">
     <w:nsid w:val="4FBF0A68"/>
     <w:multiLevelType w:val="hybridMultilevel"/>
     <w:tmpl w:val="B734E478"/>
@@ -7357,7 +7583,7 @@
       </w:rPr>
     </w:lvl>
   </w:abstractNum>
-  <w:abstractNum w:abstractNumId="14">
+  <w:abstractNum w:abstractNumId="15">
     <w:nsid w:val="53D43E66"/>
     <w:multiLevelType w:val="hybridMultilevel"/>
     <w:tmpl w:val="2898B492"/>
@@ -7470,7 +7696,7 @@
       </w:rPr>
     </w:lvl>
   </w:abstractNum>
-  <w:abstractNum w:abstractNumId="15">
+  <w:abstractNum w:abstractNumId="16">
     <w:nsid w:val="555566FE"/>
     <w:multiLevelType w:val="hybridMultilevel"/>
     <w:tmpl w:val="E4424406"/>
@@ -7583,7 +7809,7 @@
       </w:rPr>
     </w:lvl>
   </w:abstractNum>
-  <w:abstractNum w:abstractNumId="16">
+  <w:abstractNum w:abstractNumId="17">
     <w:nsid w:val="56176D10"/>
     <w:multiLevelType w:val="hybridMultilevel"/>
     <w:tmpl w:val="B7B8B48E"/>
@@ -7696,7 +7922,7 @@
       </w:rPr>
     </w:lvl>
   </w:abstractNum>
-  <w:abstractNum w:abstractNumId="17">
+  <w:abstractNum w:abstractNumId="18">
     <w:nsid w:val="572562AF"/>
     <w:multiLevelType w:val="hybridMultilevel"/>
     <w:tmpl w:val="282C912C"/>
@@ -7809,7 +8035,7 @@
       </w:rPr>
     </w:lvl>
   </w:abstractNum>
-  <w:abstractNum w:abstractNumId="18">
+  <w:abstractNum w:abstractNumId="19">
     <w:nsid w:val="577E4454"/>
     <w:multiLevelType w:val="hybridMultilevel"/>
     <w:tmpl w:val="3D543FC6"/>
@@ -7922,7 +8148,120 @@
       </w:rPr>
     </w:lvl>
   </w:abstractNum>
-  <w:abstractNum w:abstractNumId="19">
+  <w:abstractNum w:abstractNumId="20">
+    <w:nsid w:val="63EF1288"/>
+    <w:multiLevelType w:val="hybridMultilevel"/>
+    <w:tmpl w:val="2520B9B6"/>
+    <w:lvl w:ilvl="0" w:tplc="04190001">
+      <w:start w:val="1"/>
+      <w:numFmt w:val="bullet"/>
+      <w:lvlText w:val=""/>
+      <w:lvlJc w:val="left"/>
+      <w:pPr>
+        <w:ind w:left="1429" w:hanging="360"/>
+      </w:pPr>
+      <w:rPr>
+        <w:rFonts w:ascii="Symbol" w:hAnsi="Symbol" w:hint="default"/>
+      </w:rPr>
+    </w:lvl>
+    <w:lvl w:ilvl="1" w:tplc="04190003" w:tentative="1">
+      <w:start w:val="1"/>
+      <w:numFmt w:val="bullet"/>
+      <w:lvlText w:val="o"/>
+      <w:lvlJc w:val="left"/>
+      <w:pPr>
+        <w:ind w:left="2149" w:hanging="360"/>
+      </w:pPr>
+      <w:rPr>
+        <w:rFonts w:ascii="Courier New" w:hAnsi="Courier New" w:cs="Courier New" w:hint="default"/>
+      </w:rPr>
+    </w:lvl>
+    <w:lvl w:ilvl="2" w:tplc="04190005" w:tentative="1">
+      <w:start w:val="1"/>
+      <w:numFmt w:val="bullet"/>
+      <w:lvlText w:val=""/>
+      <w:lvlJc w:val="left"/>
+      <w:pPr>
+        <w:ind w:left="2869" w:hanging="360"/>
+      </w:pPr>
+      <w:rPr>
+        <w:rFonts w:ascii="Wingdings" w:hAnsi="Wingdings" w:hint="default"/>
+      </w:rPr>
+    </w:lvl>
+    <w:lvl w:ilvl="3" w:tplc="04190001" w:tentative="1">
+      <w:start w:val="1"/>
+      <w:numFmt w:val="bullet"/>
+      <w:lvlText w:val=""/>
+      <w:lvlJc w:val="left"/>
+      <w:pPr>
+        <w:ind w:left="3589" w:hanging="360"/>
+      </w:pPr>
+      <w:rPr>
+        <w:rFonts w:ascii="Symbol" w:hAnsi="Symbol" w:hint="default"/>
+      </w:rPr>
+    </w:lvl>
+    <w:lvl w:ilvl="4" w:tplc="04190003" w:tentative="1">
+      <w:start w:val="1"/>
+      <w:numFmt w:val="bullet"/>
+      <w:lvlText w:val="o"/>
+      <w:lvlJc w:val="left"/>
+      <w:pPr>
+        <w:ind w:left="4309" w:hanging="360"/>
+      </w:pPr>
+      <w:rPr>
+        <w:rFonts w:ascii="Courier New" w:hAnsi="Courier New" w:cs="Courier New" w:hint="default"/>
+      </w:rPr>
+    </w:lvl>
+    <w:lvl w:ilvl="5" w:tplc="04190005" w:tentative="1">
+      <w:start w:val="1"/>
+      <w:numFmt w:val="bullet"/>
+      <w:lvlText w:val=""/>
+      <w:lvlJc w:val="left"/>
+      <w:pPr>
+        <w:ind w:left="5029" w:hanging="360"/>
+      </w:pPr>
+      <w:rPr>
+        <w:rFonts w:ascii="Wingdings" w:hAnsi="Wingdings" w:hint="default"/>
+      </w:rPr>
+    </w:lvl>
+    <w:lvl w:ilvl="6" w:tplc="04190001" w:tentative="1">
+      <w:start w:val="1"/>
+      <w:numFmt w:val="bullet"/>
+      <w:lvlText w:val=""/>
+      <w:lvlJc w:val="left"/>
+      <w:pPr>
+        <w:ind w:left="5749" w:hanging="360"/>
+      </w:pPr>
+      <w:rPr>
+        <w:rFonts w:ascii="Symbol" w:hAnsi="Symbol" w:hint="default"/>
+      </w:rPr>
+    </w:lvl>
+    <w:lvl w:ilvl="7" w:tplc="04190003" w:tentative="1">
+      <w:start w:val="1"/>
+      <w:numFmt w:val="bullet"/>
+      <w:lvlText w:val="o"/>
+      <w:lvlJc w:val="left"/>
+      <w:pPr>
+        <w:ind w:left="6469" w:hanging="360"/>
+      </w:pPr>
+      <w:rPr>
+        <w:rFonts w:ascii="Courier New" w:hAnsi="Courier New" w:cs="Courier New" w:hint="default"/>
+      </w:rPr>
+    </w:lvl>
+    <w:lvl w:ilvl="8" w:tplc="04190005" w:tentative="1">
+      <w:start w:val="1"/>
+      <w:numFmt w:val="bullet"/>
+      <w:lvlText w:val=""/>
+      <w:lvlJc w:val="left"/>
+      <w:pPr>
+        <w:ind w:left="7189" w:hanging="360"/>
+      </w:pPr>
+      <w:rPr>
+        <w:rFonts w:ascii="Wingdings" w:hAnsi="Wingdings" w:hint="default"/>
+      </w:rPr>
+    </w:lvl>
+  </w:abstractNum>
+  <w:abstractNum w:abstractNumId="21">
     <w:nsid w:val="692211B2"/>
     <w:multiLevelType w:val="hybridMultilevel"/>
     <w:tmpl w:val="33EC556E"/>
@@ -8035,7 +8374,7 @@
       </w:rPr>
     </w:lvl>
   </w:abstractNum>
-  <w:abstractNum w:abstractNumId="20">
+  <w:abstractNum w:abstractNumId="22">
     <w:nsid w:val="6B67273D"/>
     <w:multiLevelType w:val="hybridMultilevel"/>
     <w:tmpl w:val="0A7A6BD8"/>
@@ -8148,7 +8487,269 @@
       </w:rPr>
     </w:lvl>
   </w:abstractNum>
-  <w:abstractNum w:abstractNumId="21">
+  <w:abstractNum w:abstractNumId="23">
+    <w:nsid w:val="6E3E1DD8"/>
+    <w:multiLevelType w:val="hybridMultilevel"/>
+    <w:tmpl w:val="2822E8FE"/>
+    <w:lvl w:ilvl="0" w:tplc="4D5898E8">
+      <w:start w:val="1"/>
+      <w:numFmt w:val="bullet"/>
+      <w:lvlText w:val=""/>
+      <w:lvlJc w:val="left"/>
+      <w:pPr>
+        <w:ind w:left="720" w:hanging="360"/>
+      </w:pPr>
+      <w:rPr>
+        <w:rFonts w:ascii="Symbol" w:hAnsi="Symbol" w:hint="default"/>
+      </w:rPr>
+    </w:lvl>
+    <w:lvl w:ilvl="1" w:tplc="04190003" w:tentative="1">
+      <w:start w:val="1"/>
+      <w:numFmt w:val="bullet"/>
+      <w:lvlText w:val="o"/>
+      <w:lvlJc w:val="left"/>
+      <w:pPr>
+        <w:ind w:left="1440" w:hanging="360"/>
+      </w:pPr>
+      <w:rPr>
+        <w:rFonts w:ascii="Courier New" w:hAnsi="Courier New" w:cs="Courier New" w:hint="default"/>
+      </w:rPr>
+    </w:lvl>
+    <w:lvl w:ilvl="2" w:tplc="04190005" w:tentative="1">
+      <w:start w:val="1"/>
+      <w:numFmt w:val="bullet"/>
+      <w:lvlText w:val=""/>
+      <w:lvlJc w:val="left"/>
+      <w:pPr>
+        <w:ind w:left="2160" w:hanging="360"/>
+      </w:pPr>
+      <w:rPr>
+        <w:rFonts w:ascii="Wingdings" w:hAnsi="Wingdings" w:hint="default"/>
+      </w:rPr>
+    </w:lvl>
+    <w:lvl w:ilvl="3" w:tplc="04190001" w:tentative="1">
+      <w:start w:val="1"/>
+      <w:numFmt w:val="bullet"/>
+      <w:lvlText w:val=""/>
+      <w:lvlJc w:val="left"/>
+      <w:pPr>
+        <w:ind w:left="2880" w:hanging="360"/>
+      </w:pPr>
+      <w:rPr>
+        <w:rFonts w:ascii="Symbol" w:hAnsi="Symbol" w:hint="default"/>
+      </w:rPr>
+    </w:lvl>
+    <w:lvl w:ilvl="4" w:tplc="04190003" w:tentative="1">
+      <w:start w:val="1"/>
+      <w:numFmt w:val="bullet"/>
+      <w:lvlText w:val="o"/>
+      <w:lvlJc w:val="left"/>
+      <w:pPr>
+        <w:ind w:left="3600" w:hanging="360"/>
+      </w:pPr>
+      <w:rPr>
+        <w:rFonts w:ascii="Courier New" w:hAnsi="Courier New" w:cs="Courier New" w:hint="default"/>
+      </w:rPr>
+    </w:lvl>
+    <w:lvl w:ilvl="5" w:tplc="04190005" w:tentative="1">
+      <w:start w:val="1"/>
+      <w:numFmt w:val="bullet"/>
+      <w:lvlText w:val=""/>
+      <w:lvlJc w:val="left"/>
+      <w:pPr>
+        <w:ind w:left="4320" w:hanging="360"/>
+      </w:pPr>
+      <w:rPr>
+        <w:rFonts w:ascii="Wingdings" w:hAnsi="Wingdings" w:hint="default"/>
+      </w:rPr>
+    </w:lvl>
+    <w:lvl w:ilvl="6" w:tplc="04190001" w:tentative="1">
+      <w:start w:val="1"/>
+      <w:numFmt w:val="bullet"/>
+      <w:lvlText w:val=""/>
+      <w:lvlJc w:val="left"/>
+      <w:pPr>
+        <w:ind w:left="5040" w:hanging="360"/>
+      </w:pPr>
+      <w:rPr>
+        <w:rFonts w:ascii="Symbol" w:hAnsi="Symbol" w:hint="default"/>
+      </w:rPr>
+    </w:lvl>
+    <w:lvl w:ilvl="7" w:tplc="04190003" w:tentative="1">
+      <w:start w:val="1"/>
+      <w:numFmt w:val="bullet"/>
+      <w:lvlText w:val="o"/>
+      <w:lvlJc w:val="left"/>
+      <w:pPr>
+        <w:ind w:left="5760" w:hanging="360"/>
+      </w:pPr>
+      <w:rPr>
+        <w:rFonts w:ascii="Courier New" w:hAnsi="Courier New" w:cs="Courier New" w:hint="default"/>
+      </w:rPr>
+    </w:lvl>
+    <w:lvl w:ilvl="8" w:tplc="04190005" w:tentative="1">
+      <w:start w:val="1"/>
+      <w:numFmt w:val="bullet"/>
+      <w:lvlText w:val=""/>
+      <w:lvlJc w:val="left"/>
+      <w:pPr>
+        <w:ind w:left="6480" w:hanging="360"/>
+      </w:pPr>
+      <w:rPr>
+        <w:rFonts w:ascii="Wingdings" w:hAnsi="Wingdings" w:hint="default"/>
+      </w:rPr>
+    </w:lvl>
+  </w:abstractNum>
+  <w:abstractNum w:abstractNumId="24">
+    <w:nsid w:val="749F525B"/>
+    <w:multiLevelType w:val="multilevel"/>
+    <w:tmpl w:val="829ADC2E"/>
+    <w:lvl w:ilvl="0">
+      <w:start w:val="1"/>
+      <w:numFmt w:val="bullet"/>
+      <w:lvlText w:val=""/>
+      <w:lvlJc w:val="left"/>
+      <w:pPr>
+        <w:tabs>
+          <w:tab w:val="num" w:pos="720"/>
+        </w:tabs>
+        <w:ind w:left="720" w:hanging="360"/>
+      </w:pPr>
+      <w:rPr>
+        <w:rFonts w:ascii="Symbol" w:hAnsi="Symbol" w:hint="default"/>
+        <w:sz w:val="20"/>
+      </w:rPr>
+    </w:lvl>
+    <w:lvl w:ilvl="1" w:tentative="1">
+      <w:start w:val="1"/>
+      <w:numFmt w:val="bullet"/>
+      <w:lvlText w:val="o"/>
+      <w:lvlJc w:val="left"/>
+      <w:pPr>
+        <w:tabs>
+          <w:tab w:val="num" w:pos="1440"/>
+        </w:tabs>
+        <w:ind w:left="1440" w:hanging="360"/>
+      </w:pPr>
+      <w:rPr>
+        <w:rFonts w:ascii="Courier New" w:hAnsi="Courier New" w:hint="default"/>
+        <w:sz w:val="20"/>
+      </w:rPr>
+    </w:lvl>
+    <w:lvl w:ilvl="2" w:tentative="1">
+      <w:start w:val="1"/>
+      <w:numFmt w:val="bullet"/>
+      <w:lvlText w:val=""/>
+      <w:lvlJc w:val="left"/>
+      <w:pPr>
+        <w:tabs>
+          <w:tab w:val="num" w:pos="2160"/>
+        </w:tabs>
+        <w:ind w:left="2160" w:hanging="360"/>
+      </w:pPr>
+      <w:rPr>
+        <w:rFonts w:ascii="Wingdings" w:hAnsi="Wingdings" w:hint="default"/>
+        <w:sz w:val="20"/>
+      </w:rPr>
+    </w:lvl>
+    <w:lvl w:ilvl="3" w:tentative="1">
+      <w:start w:val="1"/>
+      <w:numFmt w:val="bullet"/>
+      <w:lvlText w:val=""/>
+      <w:lvlJc w:val="left"/>
+      <w:pPr>
+        <w:tabs>
+          <w:tab w:val="num" w:pos="2880"/>
+        </w:tabs>
+        <w:ind w:left="2880" w:hanging="360"/>
+      </w:pPr>
+      <w:rPr>
+        <w:rFonts w:ascii="Wingdings" w:hAnsi="Wingdings" w:hint="default"/>
+        <w:sz w:val="20"/>
+      </w:rPr>
+    </w:lvl>
+    <w:lvl w:ilvl="4" w:tentative="1">
+      <w:start w:val="1"/>
+      <w:numFmt w:val="bullet"/>
+      <w:lvlText w:val=""/>
+      <w:lvlJc w:val="left"/>
+      <w:pPr>
+        <w:tabs>
+          <w:tab w:val="num" w:pos="3600"/>
+        </w:tabs>
+        <w:ind w:left="3600" w:hanging="360"/>
+      </w:pPr>
+      <w:rPr>
+        <w:rFonts w:ascii="Wingdings" w:hAnsi="Wingdings" w:hint="default"/>
+        <w:sz w:val="20"/>
+      </w:rPr>
+    </w:lvl>
+    <w:lvl w:ilvl="5" w:tentative="1">
+      <w:start w:val="1"/>
+      <w:numFmt w:val="bullet"/>
+      <w:lvlText w:val=""/>
+      <w:lvlJc w:val="left"/>
+      <w:pPr>
+        <w:tabs>
+          <w:tab w:val="num" w:pos="4320"/>
+        </w:tabs>
+        <w:ind w:left="4320" w:hanging="360"/>
+      </w:pPr>
+      <w:rPr>
+        <w:rFonts w:ascii="Wingdings" w:hAnsi="Wingdings" w:hint="default"/>
+        <w:sz w:val="20"/>
+      </w:rPr>
+    </w:lvl>
+    <w:lvl w:ilvl="6" w:tentative="1">
+      <w:start w:val="1"/>
+      <w:numFmt w:val="bullet"/>
+      <w:lvlText w:val=""/>
+      <w:lvlJc w:val="left"/>
+      <w:pPr>
+        <w:tabs>
+          <w:tab w:val="num" w:pos="5040"/>
+        </w:tabs>
+        <w:ind w:left="5040" w:hanging="360"/>
+      </w:pPr>
+      <w:rPr>
+        <w:rFonts w:ascii="Wingdings" w:hAnsi="Wingdings" w:hint="default"/>
+        <w:sz w:val="20"/>
+      </w:rPr>
+    </w:lvl>
+    <w:lvl w:ilvl="7" w:tentative="1">
+      <w:start w:val="1"/>
+      <w:numFmt w:val="bullet"/>
+      <w:lvlText w:val=""/>
+      <w:lvlJc w:val="left"/>
+      <w:pPr>
+        <w:tabs>
+          <w:tab w:val="num" w:pos="5760"/>
+        </w:tabs>
+        <w:ind w:left="5760" w:hanging="360"/>
+      </w:pPr>
+      <w:rPr>
+        <w:rFonts w:ascii="Wingdings" w:hAnsi="Wingdings" w:hint="default"/>
+        <w:sz w:val="20"/>
+      </w:rPr>
+    </w:lvl>
+    <w:lvl w:ilvl="8" w:tentative="1">
+      <w:start w:val="1"/>
+      <w:numFmt w:val="bullet"/>
+      <w:lvlText w:val=""/>
+      <w:lvlJc w:val="left"/>
+      <w:pPr>
+        <w:tabs>
+          <w:tab w:val="num" w:pos="6480"/>
+        </w:tabs>
+        <w:ind w:left="6480" w:hanging="360"/>
+      </w:pPr>
+      <w:rPr>
+        <w:rFonts w:ascii="Wingdings" w:hAnsi="Wingdings" w:hint="default"/>
+        <w:sz w:val="20"/>
+      </w:rPr>
+    </w:lvl>
+  </w:abstractNum>
+  <w:abstractNum w:abstractNumId="25">
     <w:nsid w:val="77F41A9E"/>
     <w:multiLevelType w:val="hybridMultilevel"/>
     <w:tmpl w:val="A3162F84"/>
@@ -8265,67 +8866,79 @@
     <w:abstractNumId w:val="2"/>
   </w:num>
   <w:num w:numId="2">
-    <w:abstractNumId w:val="4"/>
+    <w:abstractNumId w:val="5"/>
   </w:num>
   <w:num w:numId="3">
-    <w:abstractNumId w:val="9"/>
+    <w:abstractNumId w:val="10"/>
   </w:num>
   <w:num w:numId="4">
-    <w:abstractNumId w:val="8"/>
+    <w:abstractNumId w:val="9"/>
   </w:num>
   <w:num w:numId="5">
     <w:abstractNumId w:val="0"/>
   </w:num>
   <w:num w:numId="6">
-    <w:abstractNumId w:val="7"/>
+    <w:abstractNumId w:val="8"/>
   </w:num>
   <w:num w:numId="7">
-    <w:abstractNumId w:val="19"/>
+    <w:abstractNumId w:val="21"/>
   </w:num>
   <w:num w:numId="8">
     <w:abstractNumId w:val="1"/>
   </w:num>
   <w:num w:numId="9">
+    <w:abstractNumId w:val="15"/>
+  </w:num>
+  <w:num w:numId="10">
     <w:abstractNumId w:val="14"/>
   </w:num>
-  <w:num w:numId="10">
-    <w:abstractNumId w:val="13"/>
-  </w:num>
   <w:num w:numId="11">
-    <w:abstractNumId w:val="18"/>
+    <w:abstractNumId w:val="19"/>
   </w:num>
   <w:num w:numId="12">
-    <w:abstractNumId w:val="15"/>
+    <w:abstractNumId w:val="16"/>
   </w:num>
   <w:num w:numId="13">
-    <w:abstractNumId w:val="12"/>
+    <w:abstractNumId w:val="13"/>
   </w:num>
   <w:num w:numId="14">
     <w:abstractNumId w:val="3"/>
   </w:num>
   <w:num w:numId="15">
+    <w:abstractNumId w:val="7"/>
+  </w:num>
+  <w:num w:numId="16">
+    <w:abstractNumId w:val="17"/>
+  </w:num>
+  <w:num w:numId="17">
     <w:abstractNumId w:val="6"/>
   </w:num>
-  <w:num w:numId="16">
-    <w:abstractNumId w:val="16"/>
-  </w:num>
-  <w:num w:numId="17">
-    <w:abstractNumId w:val="5"/>
-  </w:num>
   <w:num w:numId="18">
-    <w:abstractNumId w:val="10"/>
+    <w:abstractNumId w:val="11"/>
   </w:num>
   <w:num w:numId="19">
+    <w:abstractNumId w:val="22"/>
+  </w:num>
+  <w:num w:numId="20">
+    <w:abstractNumId w:val="18"/>
+  </w:num>
+  <w:num w:numId="21">
+    <w:abstractNumId w:val="12"/>
+  </w:num>
+  <w:num w:numId="22">
+    <w:abstractNumId w:val="25"/>
+  </w:num>
+  <w:num w:numId="23">
+    <w:abstractNumId w:val="24"/>
+  </w:num>
+  <w:num w:numId="24">
     <w:abstractNumId w:val="20"/>
   </w:num>
-  <w:num w:numId="20">
-    <w:abstractNumId w:val="17"/>
+  <w:num w:numId="25">
+    <w:abstractNumId w:val="4"/>
   </w:num>
-  <w:num w:numId="21">
-    <w:abstractNumId w:val="11"/>
-  </w:num>
-  <w:num w:numId="22">
-    <w:abstractNumId w:val="21"/>
+  <w:num w:numId="26">
+    <w:abstractNumId w:val="23"/>
   </w:num>
 </w:numbering>
 </file>
@@ -8953,6 +9566,23 @@
       <w:u w:color="000000"/>
     </w:rPr>
   </w:style>
+  <w:style w:type="paragraph" w:customStyle="1" w:styleId="ds-markdown-paragraph">
+    <w:name w:val="ds-markdown-paragraph"/>
+    <w:basedOn w:val="a"/>
+    <w:rsid w:val="00756C25"/>
+    <w:pPr>
+      <w:tabs>
+        <w:tab w:val="clear" w:pos="9330"/>
+      </w:tabs>
+      <w:spacing w:before="100" w:beforeAutospacing="1" w:after="100" w:afterAutospacing="1" w:line="240" w:lineRule="auto"/>
+      <w:ind w:firstLine="0"/>
+      <w:jc w:val="left"/>
+    </w:pPr>
+    <w:rPr>
+      <w:color w:val="auto"/>
+      <w:sz w:val="24"/>
+    </w:rPr>
+  </w:style>
 </w:styles>
 </file>
 

</xml_diff>